<commit_message>
DataAnalysis: passed lw6, continued lw7
</commit_message>
<xml_diff>
--- a/Data Analysis/LW6/Кадарметов_ЛР6.docx
+++ b/Data Analysis/LW6/Кадарметов_ЛР6.docx
@@ -1,6 +1,6 @@
 
 <file path=word/document.xml><?xml version="1.0" encoding="utf-8"?>
-<w:document xmlns:wpc="http://schemas.microsoft.com/office/word/2010/wordprocessingCanvas" xmlns:cx="http://schemas.microsoft.com/office/drawing/2014/chartex" xmlns:cx1="http://schemas.microsoft.com/office/drawing/2015/9/8/chartex" xmlns:cx2="http://schemas.microsoft.com/office/drawing/2015/10/21/chartex" xmlns:cx3="http://schemas.microsoft.com/office/drawing/2016/5/9/chartex" xmlns:cx4="http://schemas.microsoft.com/office/drawing/2016/5/10/chartex" xmlns:cx5="http://schemas.microsoft.com/office/drawing/2016/5/11/chartex" xmlns:cx6="http://schemas.microsoft.com/office/drawing/2016/5/12/chartex" xmlns:cx7="http://schemas.microsoft.com/office/drawing/2016/5/13/chartex" xmlns:cx8="http://schemas.microsoft.com/office/drawing/2016/5/14/chartex" xmlns:mc="http://schemas.openxmlformats.org/markup-compatibility/2006" xmlns:aink="http://schemas.microsoft.com/office/drawing/2016/ink" xmlns:am3d="http://schemas.microsoft.com/office/drawing/2017/model3d" xmlns:o="urn:schemas-microsoft-com:office:office" xmlns:r="http://schemas.openxmlformats.org/officeDocument/2006/relationships" xmlns:m="http://schemas.openxmlformats.org/officeDocument/2006/math" xmlns:v="urn:schemas-microsoft-com:vml" xmlns:wp14="http://schemas.microsoft.com/office/word/2010/wordprocessingDrawing" xmlns:wp="http://schemas.openxmlformats.org/drawingml/2006/wordprocessingDrawing" xmlns:w10="urn:schemas-microsoft-com:office:word" xmlns:w="http://schemas.openxmlformats.org/wordprocessingml/2006/main" xmlns:w14="http://schemas.microsoft.com/office/word/2010/wordml" xmlns:w15="http://schemas.microsoft.com/office/word/2012/wordml" xmlns:w16cex="http://schemas.microsoft.com/office/word/2018/wordml/cex" xmlns:w16cid="http://schemas.microsoft.com/office/word/2016/wordml/cid" xmlns:w16="http://schemas.microsoft.com/office/word/2018/wordml" xmlns:w16sdtdh="http://schemas.microsoft.com/office/word/2020/wordml/sdtdatahash" xmlns:w16se="http://schemas.microsoft.com/office/word/2015/wordml/symex" xmlns:wpg="http://schemas.microsoft.com/office/word/2010/wordprocessingGroup" xmlns:wpi="http://schemas.microsoft.com/office/word/2010/wordprocessingInk" xmlns:wne="http://schemas.microsoft.com/office/word/2006/wordml" xmlns:wps="http://schemas.microsoft.com/office/word/2010/wordprocessingShape" mc:Ignorable="w14 w15 w16se w16cid w16 w16cex w16sdtdh wp14">
+<w:document xmlns:wpc="http://schemas.microsoft.com/office/word/2010/wordprocessingCanvas" xmlns:cx="http://schemas.microsoft.com/office/drawing/2014/chartex" xmlns:cx1="http://schemas.microsoft.com/office/drawing/2015/9/8/chartex" xmlns:cx2="http://schemas.microsoft.com/office/drawing/2015/10/21/chartex" xmlns:cx3="http://schemas.microsoft.com/office/drawing/2016/5/9/chartex" xmlns:cx4="http://schemas.microsoft.com/office/drawing/2016/5/10/chartex" xmlns:cx5="http://schemas.microsoft.com/office/drawing/2016/5/11/chartex" xmlns:cx6="http://schemas.microsoft.com/office/drawing/2016/5/12/chartex" xmlns:cx7="http://schemas.microsoft.com/office/drawing/2016/5/13/chartex" xmlns:cx8="http://schemas.microsoft.com/office/drawing/2016/5/14/chartex" xmlns:mc="http://schemas.openxmlformats.org/markup-compatibility/2006" xmlns:aink="http://schemas.microsoft.com/office/drawing/2016/ink" xmlns:am3d="http://schemas.microsoft.com/office/drawing/2017/model3d" xmlns:o="urn:schemas-microsoft-com:office:office" xmlns:oel="http://schemas.microsoft.com/office/2019/extlst" xmlns:r="http://schemas.openxmlformats.org/officeDocument/2006/relationships" xmlns:m="http://schemas.openxmlformats.org/officeDocument/2006/math" xmlns:v="urn:schemas-microsoft-com:vml" xmlns:wp14="http://schemas.microsoft.com/office/word/2010/wordprocessingDrawing" xmlns:wp="http://schemas.openxmlformats.org/drawingml/2006/wordprocessingDrawing" xmlns:w10="urn:schemas-microsoft-com:office:word" xmlns:w="http://schemas.openxmlformats.org/wordprocessingml/2006/main" xmlns:w14="http://schemas.microsoft.com/office/word/2010/wordml" xmlns:w15="http://schemas.microsoft.com/office/word/2012/wordml" xmlns:w16cex="http://schemas.microsoft.com/office/word/2018/wordml/cex" xmlns:w16cid="http://schemas.microsoft.com/office/word/2016/wordml/cid" xmlns:w16="http://schemas.microsoft.com/office/word/2018/wordml" xmlns:w16du="http://schemas.microsoft.com/office/word/2023/wordml/word16du" xmlns:w16sdtdh="http://schemas.microsoft.com/office/word/2020/wordml/sdtdatahash" xmlns:w16sdtfl="http://schemas.microsoft.com/office/word/2024/wordml/sdtformatlock" xmlns:w16se="http://schemas.microsoft.com/office/word/2015/wordml/symex" xmlns:wpg="http://schemas.microsoft.com/office/word/2010/wordprocessingGroup" xmlns:wpi="http://schemas.microsoft.com/office/word/2010/wordprocessingInk" xmlns:wne="http://schemas.microsoft.com/office/word/2006/wordml" xmlns:wps="http://schemas.microsoft.com/office/word/2010/wordprocessingShape" mc:Ignorable="w14 w15 w16se w16cid w16 w16cex w16sdtdh w16sdtfl w16du wp14">
   <w:body>
     <w:p>
       <w:pPr>
@@ -513,7 +513,7 @@
     </w:p>
     <w:p>
       <w:pPr>
-        <w:jc w:val="both"/>
+        <w:jc w:val="center"/>
         <w:rPr>
           <w:rFonts w:ascii="Times New Roman" w:hAnsi="Times New Roman" w:cs="Times New Roman"/>
           <w:caps/>
@@ -569,15 +569,7 @@
           <w:sz w:val="24"/>
           <w:szCs w:val="24"/>
         </w:rPr>
-        <w:t xml:space="preserve"> – цветы Ириса. </w:t>
-      </w:r>
-      <w:r>
-        <w:rPr>
-          <w:rFonts w:ascii="Times New Roman" w:hAnsi="Times New Roman" w:cs="Times New Roman"/>
-          <w:sz w:val="24"/>
-          <w:szCs w:val="24"/>
-        </w:rPr>
-        <w:t xml:space="preserve">Ирисы бывают корневищные и луковичные, делятся на две большие группы — бородатые (с волосками на лепестках, самая многочисленная группа) и безбородые (с гладкими лепестками), которые включают сибирские, японские, луизианские, калифорнийские, </w:t>
+        <w:t xml:space="preserve"> – цветы Ириса. Ирисы бывают корневищные и луковичные, делятся на две большие группы — бородатые (с волосками на лепестках, самая многочисленная группа) и безбородые (с гладкими лепестками), которые включают сибирские, японские, луизианские, калифорнийские, </w:t>
       </w:r>
       <w:proofErr w:type="spellStart"/>
       <w:r>
@@ -649,15 +641,7 @@
           <w:sz w:val="24"/>
           <w:szCs w:val="24"/>
         </w:rPr>
-        <w:t>, различаются по высоте, форме цветка, окрасу и требованиям к условиям</w:t>
-      </w:r>
-      <w:r>
-        <w:rPr>
-          <w:rFonts w:ascii="Times New Roman" w:hAnsi="Times New Roman" w:cs="Times New Roman"/>
-          <w:sz w:val="24"/>
-          <w:szCs w:val="24"/>
-        </w:rPr>
-        <w:t>.</w:t>
+        <w:t>, различаются по высоте, форме цветка, окрасу и требованиям к условиям.</w:t>
       </w:r>
     </w:p>
     <w:p>
@@ -685,15 +669,7 @@
           <w:sz w:val="24"/>
           <w:szCs w:val="24"/>
         </w:rPr>
-        <w:t xml:space="preserve">- </w:t>
-      </w:r>
-      <w:r>
-        <w:rPr>
-          <w:rFonts w:ascii="Times New Roman" w:hAnsi="Times New Roman" w:cs="Times New Roman"/>
-          <w:sz w:val="24"/>
-          <w:szCs w:val="24"/>
-        </w:rPr>
-        <w:t xml:space="preserve"> набор</w:t>
+        <w:t>-  набор</w:t>
       </w:r>
       <w:proofErr w:type="gramEnd"/>
       <w:r>
@@ -711,15 +687,7 @@
           <w:szCs w:val="24"/>
         </w:rPr>
         <w:lastRenderedPageBreak/>
-        <w:t>Фишер в 1936 году продемонстрировал работу разработанного им метода дискриминантного анализа</w:t>
-      </w:r>
-      <w:r>
-        <w:rPr>
-          <w:rFonts w:ascii="Times New Roman" w:hAnsi="Times New Roman" w:cs="Times New Roman"/>
-          <w:sz w:val="24"/>
-          <w:szCs w:val="24"/>
-        </w:rPr>
-        <w:t xml:space="preserve">. </w:t>
+        <w:t xml:space="preserve">Фишер в 1936 году продемонстрировал работу разработанного им метода дискриминантного анализа. </w:t>
       </w:r>
     </w:p>
     <w:p>
@@ -899,8 +867,50 @@
           <w:sz w:val="24"/>
           <w:szCs w:val="24"/>
         </w:rPr>
-        <w:t>Порог точности – 85%, т.е.</w:t>
+        <w:t xml:space="preserve">Порог </w:t>
       </w:r>
+      <w:r>
+        <w:rPr>
+          <w:rFonts w:ascii="Times New Roman" w:hAnsi="Times New Roman" w:cs="Times New Roman"/>
+          <w:sz w:val="24"/>
+          <w:szCs w:val="24"/>
+        </w:rPr>
+        <w:t xml:space="preserve">необходимой </w:t>
+      </w:r>
+      <w:r>
+        <w:rPr>
+          <w:rFonts w:ascii="Times New Roman" w:hAnsi="Times New Roman" w:cs="Times New Roman"/>
+          <w:sz w:val="24"/>
+          <w:szCs w:val="24"/>
+        </w:rPr>
+        <w:t>точности</w:t>
+      </w:r>
+      <w:r>
+        <w:rPr>
+          <w:rFonts w:ascii="Times New Roman" w:hAnsi="Times New Roman" w:cs="Times New Roman"/>
+          <w:sz w:val="24"/>
+          <w:szCs w:val="24"/>
+        </w:rPr>
+        <w:t xml:space="preserve"> классификации</w:t>
+      </w:r>
+      <w:r>
+        <w:rPr>
+          <w:rFonts w:ascii="Times New Roman" w:hAnsi="Times New Roman" w:cs="Times New Roman"/>
+          <w:sz w:val="24"/>
+          <w:szCs w:val="24"/>
+        </w:rPr>
+        <w:t xml:space="preserve"> – 85%, </w:t>
+      </w:r>
+      <w:proofErr w:type="gramStart"/>
+      <w:r>
+        <w:rPr>
+          <w:rFonts w:ascii="Times New Roman" w:hAnsi="Times New Roman" w:cs="Times New Roman"/>
+          <w:sz w:val="24"/>
+          <w:szCs w:val="24"/>
+        </w:rPr>
+        <w:t>т.е.</w:t>
+      </w:r>
+      <w:proofErr w:type="gramEnd"/>
     </w:p>
     <w:p>
       <w:pPr>
@@ -919,8 +929,9 @@
               <w:rFonts w:ascii="Cambria Math" w:hAnsi="Cambria Math" w:cs="Times New Roman"/>
               <w:sz w:val="24"/>
               <w:szCs w:val="24"/>
+              <w:lang w:val="en-US"/>
             </w:rPr>
-            <m:t>ε=</m:t>
+            <m:t>Prec</m:t>
           </m:r>
           <m:r>
             <w:rPr>
@@ -928,7 +939,7 @@
               <w:sz w:val="24"/>
               <w:szCs w:val="24"/>
             </w:rPr>
-            <m:t>0,85</m:t>
+            <m:t>=0,85</m:t>
           </m:r>
         </m:oMath>
       </m:oMathPara>
@@ -1003,17 +1014,6 @@
         </w:rPr>
         <w:t>Набор объектов:</w:t>
       </w:r>
-    </w:p>
-    <w:p>
-      <w:pPr>
-        <w:pStyle w:val="a3"/>
-        <w:jc w:val="both"/>
-        <w:rPr>
-          <w:rFonts w:ascii="Times New Roman" w:hAnsi="Times New Roman" w:cs="Times New Roman"/>
-          <w:sz w:val="24"/>
-          <w:szCs w:val="24"/>
-        </w:rPr>
-      </w:pPr>
     </w:p>
     <w:tbl>
       <w:tblPr>
@@ -4987,6 +4987,17 @@
         </w:tc>
       </w:tr>
     </w:tbl>
+    <w:p>
+      <w:pPr>
+        <w:ind w:firstLine="708"/>
+        <w:jc w:val="both"/>
+        <w:rPr>
+          <w:rFonts w:ascii="Times New Roman" w:hAnsi="Times New Roman" w:cs="Times New Roman"/>
+          <w:sz w:val="24"/>
+          <w:szCs w:val="24"/>
+        </w:rPr>
+      </w:pPr>
+    </w:p>
     <w:p>
       <w:pPr>
         <w:ind w:firstLine="708"/>
@@ -6142,7 +6153,414 @@
           <w:sz w:val="24"/>
           <w:szCs w:val="24"/>
         </w:rPr>
-        <w:t xml:space="preserve">Построим таблицу значений расстояний от нового объекта до каждого объекта обучающей выборки в соответствии с алгоритмом </w:t>
+        <w:t xml:space="preserve">Возьмем первый объект из тестирующей выборки: </w:t>
+      </w:r>
+    </w:p>
+    <w:tbl>
+      <w:tblPr>
+        <w:tblW w:w="4593" w:type="dxa"/>
+        <w:jc w:val="center"/>
+        <w:tblBorders>
+          <w:top w:val="single" w:sz="4" w:space="0" w:color="196B24" w:themeColor="accent3"/>
+          <w:left w:val="single" w:sz="4" w:space="0" w:color="196B24" w:themeColor="accent3"/>
+          <w:bottom w:val="single" w:sz="4" w:space="0" w:color="196B24" w:themeColor="accent3"/>
+          <w:right w:val="single" w:sz="4" w:space="0" w:color="196B24" w:themeColor="accent3"/>
+          <w:insideH w:val="single" w:sz="4" w:space="0" w:color="196B24" w:themeColor="accent3"/>
+          <w:insideV w:val="single" w:sz="4" w:space="0" w:color="196B24" w:themeColor="accent3"/>
+        </w:tblBorders>
+        <w:tblLook w:val="04A0" w:firstRow="1" w:lastRow="0" w:firstColumn="1" w:lastColumn="0" w:noHBand="0" w:noVBand="1"/>
+      </w:tblPr>
+      <w:tblGrid>
+        <w:gridCol w:w="474"/>
+        <w:gridCol w:w="1483"/>
+        <w:gridCol w:w="1430"/>
+        <w:gridCol w:w="1420"/>
+      </w:tblGrid>
+      <w:tr>
+        <w:trPr>
+          <w:trHeight w:val="300"/>
+          <w:jc w:val="center"/>
+        </w:trPr>
+        <w:tc>
+          <w:tcPr>
+            <w:tcW w:w="474" w:type="dxa"/>
+            <w:shd w:val="clear" w:color="E2EFDA" w:fill="E2EFDA"/>
+            <w:noWrap/>
+            <w:vAlign w:val="bottom"/>
+            <w:hideMark/>
+          </w:tcPr>
+          <w:p>
+            <w:pPr>
+              <w:spacing w:after="0" w:line="240" w:lineRule="auto"/>
+              <w:jc w:val="both"/>
+              <w:rPr>
+                <w:rFonts w:ascii="Times New Roman" w:eastAsia="Times New Roman" w:hAnsi="Times New Roman" w:cs="Times New Roman"/>
+                <w:b/>
+                <w:bCs/>
+                <w:color w:val="0D0D0D"/>
+                <w:kern w:val="0"/>
+                <w:sz w:val="24"/>
+                <w:szCs w:val="24"/>
+                <w:lang w:eastAsia="ru-RU"/>
+                <w14:ligatures w14:val="none"/>
+              </w:rPr>
+            </w:pPr>
+            <w:r>
+              <w:rPr>
+                <w:rFonts w:ascii="Times New Roman" w:eastAsia="Times New Roman" w:hAnsi="Times New Roman" w:cs="Times New Roman"/>
+                <w:b/>
+                <w:bCs/>
+                <w:color w:val="0D0D0D"/>
+                <w:kern w:val="0"/>
+                <w:sz w:val="24"/>
+                <w:szCs w:val="24"/>
+                <w:lang w:eastAsia="ru-RU"/>
+                <w14:ligatures w14:val="none"/>
+              </w:rPr>
+              <w:t>№</w:t>
+            </w:r>
+          </w:p>
+        </w:tc>
+        <w:tc>
+          <w:tcPr>
+            <w:tcW w:w="1375" w:type="dxa"/>
+            <w:shd w:val="clear" w:color="E2EFDA" w:fill="E2EFDA"/>
+            <w:noWrap/>
+            <w:vAlign w:val="bottom"/>
+            <w:hideMark/>
+          </w:tcPr>
+          <w:p>
+            <w:pPr>
+              <w:spacing w:after="0" w:line="240" w:lineRule="auto"/>
+              <w:jc w:val="both"/>
+              <w:rPr>
+                <w:rFonts w:ascii="Times New Roman" w:eastAsia="Times New Roman" w:hAnsi="Times New Roman" w:cs="Times New Roman"/>
+                <w:b/>
+                <w:bCs/>
+                <w:color w:val="0D0D0D"/>
+                <w:kern w:val="0"/>
+                <w:sz w:val="24"/>
+                <w:szCs w:val="24"/>
+                <w:lang w:eastAsia="ru-RU"/>
+                <w14:ligatures w14:val="none"/>
+              </w:rPr>
+            </w:pPr>
+            <w:proofErr w:type="spellStart"/>
+            <w:r>
+              <w:rPr>
+                <w:rFonts w:ascii="Times New Roman" w:eastAsia="Times New Roman" w:hAnsi="Times New Roman" w:cs="Times New Roman"/>
+                <w:b/>
+                <w:bCs/>
+                <w:color w:val="0D0D0D"/>
+                <w:kern w:val="0"/>
+                <w:sz w:val="24"/>
+                <w:szCs w:val="24"/>
+                <w:lang w:eastAsia="ru-RU"/>
+                <w14:ligatures w14:val="none"/>
+              </w:rPr>
+              <w:t>petal_length</w:t>
+            </w:r>
+            <w:proofErr w:type="spellEnd"/>
+          </w:p>
+        </w:tc>
+        <w:tc>
+          <w:tcPr>
+            <w:tcW w:w="1324" w:type="dxa"/>
+            <w:shd w:val="clear" w:color="E2EFDA" w:fill="E2EFDA"/>
+            <w:noWrap/>
+            <w:vAlign w:val="bottom"/>
+            <w:hideMark/>
+          </w:tcPr>
+          <w:p>
+            <w:pPr>
+              <w:spacing w:after="0" w:line="240" w:lineRule="auto"/>
+              <w:jc w:val="both"/>
+              <w:rPr>
+                <w:rFonts w:ascii="Times New Roman" w:eastAsia="Times New Roman" w:hAnsi="Times New Roman" w:cs="Times New Roman"/>
+                <w:b/>
+                <w:bCs/>
+                <w:color w:val="0D0D0D"/>
+                <w:kern w:val="0"/>
+                <w:sz w:val="24"/>
+                <w:szCs w:val="24"/>
+                <w:lang w:eastAsia="ru-RU"/>
+                <w14:ligatures w14:val="none"/>
+              </w:rPr>
+            </w:pPr>
+            <w:proofErr w:type="spellStart"/>
+            <w:r>
+              <w:rPr>
+                <w:rFonts w:ascii="Times New Roman" w:eastAsia="Times New Roman" w:hAnsi="Times New Roman" w:cs="Times New Roman"/>
+                <w:b/>
+                <w:bCs/>
+                <w:color w:val="0D0D0D"/>
+                <w:kern w:val="0"/>
+                <w:sz w:val="24"/>
+                <w:szCs w:val="24"/>
+                <w:lang w:eastAsia="ru-RU"/>
+                <w14:ligatures w14:val="none"/>
+              </w:rPr>
+              <w:t>petal_width</w:t>
+            </w:r>
+            <w:proofErr w:type="spellEnd"/>
+          </w:p>
+        </w:tc>
+        <w:tc>
+          <w:tcPr>
+            <w:tcW w:w="1420" w:type="dxa"/>
+            <w:shd w:val="clear" w:color="E2EFDA" w:fill="E2EFDA"/>
+            <w:noWrap/>
+            <w:vAlign w:val="bottom"/>
+            <w:hideMark/>
+          </w:tcPr>
+          <w:p>
+            <w:pPr>
+              <w:spacing w:after="0" w:line="240" w:lineRule="auto"/>
+              <w:jc w:val="both"/>
+              <w:rPr>
+                <w:rFonts w:ascii="Times New Roman" w:eastAsia="Times New Roman" w:hAnsi="Times New Roman" w:cs="Times New Roman"/>
+                <w:b/>
+                <w:bCs/>
+                <w:color w:val="0D0D0D"/>
+                <w:kern w:val="0"/>
+                <w:sz w:val="24"/>
+                <w:szCs w:val="24"/>
+                <w:lang w:eastAsia="ru-RU"/>
+                <w14:ligatures w14:val="none"/>
+              </w:rPr>
+            </w:pPr>
+            <w:proofErr w:type="spellStart"/>
+            <w:r>
+              <w:rPr>
+                <w:rFonts w:ascii="Times New Roman" w:eastAsia="Times New Roman" w:hAnsi="Times New Roman" w:cs="Times New Roman"/>
+                <w:b/>
+                <w:bCs/>
+                <w:color w:val="0D0D0D"/>
+                <w:kern w:val="0"/>
+                <w:sz w:val="24"/>
+                <w:szCs w:val="24"/>
+                <w:lang w:eastAsia="ru-RU"/>
+                <w14:ligatures w14:val="none"/>
+              </w:rPr>
+              <w:t>species</w:t>
+            </w:r>
+            <w:proofErr w:type="spellEnd"/>
+          </w:p>
+        </w:tc>
+      </w:tr>
+      <w:tr>
+        <w:trPr>
+          <w:trHeight w:val="300"/>
+          <w:jc w:val="center"/>
+        </w:trPr>
+        <w:tc>
+          <w:tcPr>
+            <w:tcW w:w="474" w:type="dxa"/>
+            <w:shd w:val="clear" w:color="E2EFDA" w:fill="E2EFDA"/>
+            <w:noWrap/>
+            <w:vAlign w:val="bottom"/>
+            <w:hideMark/>
+          </w:tcPr>
+          <w:p>
+            <w:pPr>
+              <w:spacing w:after="0" w:line="240" w:lineRule="auto"/>
+              <w:jc w:val="both"/>
+              <w:rPr>
+                <w:rFonts w:ascii="Times New Roman" w:eastAsia="Times New Roman" w:hAnsi="Times New Roman" w:cs="Times New Roman"/>
+                <w:color w:val="000000"/>
+                <w:kern w:val="0"/>
+                <w:sz w:val="24"/>
+                <w:szCs w:val="24"/>
+                <w:lang w:eastAsia="ru-RU"/>
+                <w14:ligatures w14:val="none"/>
+              </w:rPr>
+            </w:pPr>
+            <w:r>
+              <w:rPr>
+                <w:rFonts w:ascii="Times New Roman" w:eastAsia="Times New Roman" w:hAnsi="Times New Roman" w:cs="Times New Roman"/>
+                <w:color w:val="000000"/>
+                <w:kern w:val="0"/>
+                <w:sz w:val="24"/>
+                <w:szCs w:val="24"/>
+                <w:lang w:eastAsia="ru-RU"/>
+                <w14:ligatures w14:val="none"/>
+              </w:rPr>
+              <w:t>1</w:t>
+            </w:r>
+          </w:p>
+        </w:tc>
+        <w:tc>
+          <w:tcPr>
+            <w:tcW w:w="1375" w:type="dxa"/>
+            <w:shd w:val="clear" w:color="E2EFDA" w:fill="E2EFDA"/>
+            <w:noWrap/>
+            <w:vAlign w:val="bottom"/>
+            <w:hideMark/>
+          </w:tcPr>
+          <w:p>
+            <w:pPr>
+              <w:spacing w:after="0" w:line="240" w:lineRule="auto"/>
+              <w:jc w:val="both"/>
+              <w:rPr>
+                <w:rFonts w:ascii="Times New Roman" w:eastAsia="Times New Roman" w:hAnsi="Times New Roman" w:cs="Times New Roman"/>
+                <w:color w:val="000000"/>
+                <w:kern w:val="0"/>
+                <w:sz w:val="24"/>
+                <w:szCs w:val="24"/>
+                <w:lang w:eastAsia="ru-RU"/>
+                <w14:ligatures w14:val="none"/>
+              </w:rPr>
+            </w:pPr>
+            <w:r>
+              <w:rPr>
+                <w:rFonts w:ascii="Times New Roman" w:eastAsia="Times New Roman" w:hAnsi="Times New Roman" w:cs="Times New Roman"/>
+                <w:color w:val="000000"/>
+                <w:kern w:val="0"/>
+                <w:sz w:val="24"/>
+                <w:szCs w:val="24"/>
+                <w:lang w:eastAsia="ru-RU"/>
+                <w14:ligatures w14:val="none"/>
+              </w:rPr>
+              <w:t>1,5</w:t>
+            </w:r>
+          </w:p>
+        </w:tc>
+        <w:tc>
+          <w:tcPr>
+            <w:tcW w:w="1324" w:type="dxa"/>
+            <w:shd w:val="clear" w:color="E2EFDA" w:fill="E2EFDA"/>
+            <w:noWrap/>
+            <w:vAlign w:val="bottom"/>
+            <w:hideMark/>
+          </w:tcPr>
+          <w:p>
+            <w:pPr>
+              <w:spacing w:after="0" w:line="240" w:lineRule="auto"/>
+              <w:jc w:val="both"/>
+              <w:rPr>
+                <w:rFonts w:ascii="Times New Roman" w:eastAsia="Times New Roman" w:hAnsi="Times New Roman" w:cs="Times New Roman"/>
+                <w:color w:val="000000"/>
+                <w:kern w:val="0"/>
+                <w:sz w:val="24"/>
+                <w:szCs w:val="24"/>
+                <w:lang w:eastAsia="ru-RU"/>
+                <w14:ligatures w14:val="none"/>
+              </w:rPr>
+            </w:pPr>
+            <w:r>
+              <w:rPr>
+                <w:rFonts w:ascii="Times New Roman" w:eastAsia="Times New Roman" w:hAnsi="Times New Roman" w:cs="Times New Roman"/>
+                <w:color w:val="000000"/>
+                <w:kern w:val="0"/>
+                <w:sz w:val="24"/>
+                <w:szCs w:val="24"/>
+                <w:lang w:eastAsia="ru-RU"/>
+                <w14:ligatures w14:val="none"/>
+              </w:rPr>
+              <w:t>0,2</w:t>
+            </w:r>
+          </w:p>
+        </w:tc>
+        <w:tc>
+          <w:tcPr>
+            <w:tcW w:w="1420" w:type="dxa"/>
+            <w:shd w:val="clear" w:color="E2EFDA" w:fill="E2EFDA"/>
+            <w:noWrap/>
+            <w:vAlign w:val="bottom"/>
+            <w:hideMark/>
+          </w:tcPr>
+          <w:p>
+            <w:pPr>
+              <w:spacing w:after="0" w:line="240" w:lineRule="auto"/>
+              <w:jc w:val="both"/>
+              <w:rPr>
+                <w:rFonts w:ascii="Times New Roman" w:eastAsia="Times New Roman" w:hAnsi="Times New Roman" w:cs="Times New Roman"/>
+                <w:color w:val="000000"/>
+                <w:kern w:val="0"/>
+                <w:sz w:val="24"/>
+                <w:szCs w:val="24"/>
+                <w:lang w:eastAsia="ru-RU"/>
+                <w14:ligatures w14:val="none"/>
+              </w:rPr>
+            </w:pPr>
+            <w:proofErr w:type="spellStart"/>
+            <w:r>
+              <w:rPr>
+                <w:rFonts w:ascii="Times New Roman" w:eastAsia="Times New Roman" w:hAnsi="Times New Roman" w:cs="Times New Roman"/>
+                <w:color w:val="000000"/>
+                <w:kern w:val="0"/>
+                <w:sz w:val="24"/>
+                <w:szCs w:val="24"/>
+                <w:lang w:eastAsia="ru-RU"/>
+                <w14:ligatures w14:val="none"/>
+              </w:rPr>
+              <w:t>setosa</w:t>
+            </w:r>
+            <w:proofErr w:type="spellEnd"/>
+          </w:p>
+        </w:tc>
+      </w:tr>
+    </w:tbl>
+    <w:p>
+      <w:pPr>
+        <w:pStyle w:val="a3"/>
+        <w:jc w:val="both"/>
+        <w:rPr>
+          <w:rFonts w:ascii="Times New Roman" w:hAnsi="Times New Roman" w:cs="Times New Roman"/>
+          <w:sz w:val="24"/>
+          <w:szCs w:val="24"/>
+        </w:rPr>
+      </w:pPr>
+    </w:p>
+    <w:p>
+      <w:pPr>
+        <w:pStyle w:val="a3"/>
+        <w:jc w:val="both"/>
+        <w:rPr>
+          <w:rFonts w:ascii="Times New Roman" w:hAnsi="Times New Roman" w:cs="Times New Roman"/>
+          <w:sz w:val="24"/>
+          <w:szCs w:val="24"/>
+        </w:rPr>
+      </w:pPr>
+      <w:r>
+        <w:rPr>
+          <w:rFonts w:ascii="Times New Roman" w:hAnsi="Times New Roman" w:cs="Times New Roman"/>
+          <w:sz w:val="24"/>
+          <w:szCs w:val="24"/>
+        </w:rPr>
+        <w:t xml:space="preserve">Построим таблицу значений расстояний от </w:t>
+      </w:r>
+      <w:r>
+        <w:rPr>
+          <w:rFonts w:ascii="Times New Roman" w:hAnsi="Times New Roman" w:cs="Times New Roman"/>
+          <w:sz w:val="24"/>
+          <w:szCs w:val="24"/>
+        </w:rPr>
+        <w:t>первого</w:t>
+      </w:r>
+      <w:r>
+        <w:rPr>
+          <w:rFonts w:ascii="Times New Roman" w:hAnsi="Times New Roman" w:cs="Times New Roman"/>
+          <w:sz w:val="24"/>
+          <w:szCs w:val="24"/>
+        </w:rPr>
+        <w:t xml:space="preserve"> объекта</w:t>
+      </w:r>
+      <w:r>
+        <w:rPr>
+          <w:rFonts w:ascii="Times New Roman" w:hAnsi="Times New Roman" w:cs="Times New Roman"/>
+          <w:sz w:val="24"/>
+          <w:szCs w:val="24"/>
+        </w:rPr>
+        <w:t xml:space="preserve"> тестирующей выборки</w:t>
+      </w:r>
+      <w:r>
+        <w:rPr>
+          <w:rFonts w:ascii="Times New Roman" w:hAnsi="Times New Roman" w:cs="Times New Roman"/>
+          <w:sz w:val="24"/>
+          <w:szCs w:val="24"/>
+        </w:rPr>
+        <w:t xml:space="preserve"> до каждого объекта обучающей выборки в соответствии с алгоритмом </w:t>
       </w:r>
       <w:r>
         <w:rPr>
@@ -6393,7 +6811,6 @@
               <w:bottom w:val="single" w:sz="4" w:space="0" w:color="A9D08E"/>
               <w:right w:val="nil"/>
             </w:tcBorders>
-            <w:shd w:val="clear" w:color="auto" w:fill="auto"/>
             <w:noWrap/>
             <w:vAlign w:val="bottom"/>
             <w:hideMark/>
@@ -6435,7 +6852,6 @@
               <w:bottom w:val="single" w:sz="4" w:space="0" w:color="A9D08E"/>
               <w:right w:val="single" w:sz="4" w:space="0" w:color="A9D08E"/>
             </w:tcBorders>
-            <w:shd w:val="clear" w:color="auto" w:fill="auto"/>
             <w:noWrap/>
             <w:vAlign w:val="bottom"/>
             <w:hideMark/>
@@ -6577,7 +6993,6 @@
               <w:bottom w:val="single" w:sz="4" w:space="0" w:color="A9D08E"/>
               <w:right w:val="nil"/>
             </w:tcBorders>
-            <w:shd w:val="clear" w:color="auto" w:fill="auto"/>
             <w:noWrap/>
             <w:vAlign w:val="bottom"/>
             <w:hideMark/>
@@ -6619,7 +7034,6 @@
               <w:bottom w:val="single" w:sz="4" w:space="0" w:color="A9D08E"/>
               <w:right w:val="single" w:sz="4" w:space="0" w:color="A9D08E"/>
             </w:tcBorders>
-            <w:shd w:val="clear" w:color="auto" w:fill="auto"/>
             <w:noWrap/>
             <w:vAlign w:val="bottom"/>
             <w:hideMark/>
@@ -6761,7 +7175,6 @@
               <w:bottom w:val="single" w:sz="4" w:space="0" w:color="A9D08E"/>
               <w:right w:val="nil"/>
             </w:tcBorders>
-            <w:shd w:val="clear" w:color="auto" w:fill="auto"/>
             <w:noWrap/>
             <w:vAlign w:val="bottom"/>
             <w:hideMark/>
@@ -6803,7 +7216,6 @@
               <w:bottom w:val="single" w:sz="4" w:space="0" w:color="A9D08E"/>
               <w:right w:val="single" w:sz="4" w:space="0" w:color="A9D08E"/>
             </w:tcBorders>
-            <w:shd w:val="clear" w:color="auto" w:fill="auto"/>
             <w:noWrap/>
             <w:vAlign w:val="bottom"/>
             <w:hideMark/>
@@ -6945,7 +7357,6 @@
               <w:bottom w:val="single" w:sz="4" w:space="0" w:color="A9D08E"/>
               <w:right w:val="nil"/>
             </w:tcBorders>
-            <w:shd w:val="clear" w:color="auto" w:fill="auto"/>
             <w:noWrap/>
             <w:vAlign w:val="bottom"/>
             <w:hideMark/>
@@ -6987,7 +7398,6 @@
               <w:bottom w:val="single" w:sz="4" w:space="0" w:color="A9D08E"/>
               <w:right w:val="single" w:sz="4" w:space="0" w:color="A9D08E"/>
             </w:tcBorders>
-            <w:shd w:val="clear" w:color="auto" w:fill="auto"/>
             <w:noWrap/>
             <w:vAlign w:val="bottom"/>
             <w:hideMark/>
@@ -7129,7 +7539,6 @@
               <w:bottom w:val="single" w:sz="4" w:space="0" w:color="A9D08E"/>
               <w:right w:val="nil"/>
             </w:tcBorders>
-            <w:shd w:val="clear" w:color="auto" w:fill="auto"/>
             <w:noWrap/>
             <w:vAlign w:val="bottom"/>
             <w:hideMark/>
@@ -7171,7 +7580,6 @@
               <w:bottom w:val="single" w:sz="4" w:space="0" w:color="A9D08E"/>
               <w:right w:val="single" w:sz="4" w:space="0" w:color="A9D08E"/>
             </w:tcBorders>
-            <w:shd w:val="clear" w:color="auto" w:fill="auto"/>
             <w:noWrap/>
             <w:vAlign w:val="bottom"/>
             <w:hideMark/>
@@ -7313,7 +7721,6 @@
               <w:bottom w:val="single" w:sz="4" w:space="0" w:color="A9D08E"/>
               <w:right w:val="nil"/>
             </w:tcBorders>
-            <w:shd w:val="clear" w:color="auto" w:fill="auto"/>
             <w:noWrap/>
             <w:vAlign w:val="bottom"/>
             <w:hideMark/>
@@ -7355,7 +7762,6 @@
               <w:bottom w:val="single" w:sz="4" w:space="0" w:color="A9D08E"/>
               <w:right w:val="single" w:sz="4" w:space="0" w:color="A9D08E"/>
             </w:tcBorders>
-            <w:shd w:val="clear" w:color="auto" w:fill="auto"/>
             <w:noWrap/>
             <w:vAlign w:val="bottom"/>
             <w:hideMark/>
@@ -7497,7 +7903,6 @@
               <w:bottom w:val="single" w:sz="4" w:space="0" w:color="A9D08E"/>
               <w:right w:val="nil"/>
             </w:tcBorders>
-            <w:shd w:val="clear" w:color="auto" w:fill="auto"/>
             <w:noWrap/>
             <w:vAlign w:val="bottom"/>
             <w:hideMark/>
@@ -7539,7 +7944,6 @@
               <w:bottom w:val="single" w:sz="4" w:space="0" w:color="A9D08E"/>
               <w:right w:val="single" w:sz="4" w:space="0" w:color="A9D08E"/>
             </w:tcBorders>
-            <w:shd w:val="clear" w:color="auto" w:fill="auto"/>
             <w:noWrap/>
             <w:vAlign w:val="bottom"/>
             <w:hideMark/>
@@ -7820,7 +8224,6 @@
               <w:bottom w:val="single" w:sz="4" w:space="0" w:color="A9D08E"/>
               <w:right w:val="nil"/>
             </w:tcBorders>
-            <w:shd w:val="clear" w:color="auto" w:fill="auto"/>
             <w:noWrap/>
             <w:vAlign w:val="bottom"/>
             <w:hideMark/>
@@ -7862,7 +8265,6 @@
               <w:bottom w:val="single" w:sz="4" w:space="0" w:color="A9D08E"/>
               <w:right w:val="single" w:sz="4" w:space="0" w:color="A9D08E"/>
             </w:tcBorders>
-            <w:shd w:val="clear" w:color="auto" w:fill="auto"/>
             <w:noWrap/>
             <w:vAlign w:val="bottom"/>
             <w:hideMark/>
@@ -8004,7 +8406,6 @@
               <w:bottom w:val="single" w:sz="4" w:space="0" w:color="A9D08E"/>
               <w:right w:val="nil"/>
             </w:tcBorders>
-            <w:shd w:val="clear" w:color="auto" w:fill="auto"/>
             <w:noWrap/>
             <w:vAlign w:val="bottom"/>
             <w:hideMark/>
@@ -8046,7 +8447,6 @@
               <w:bottom w:val="single" w:sz="4" w:space="0" w:color="A9D08E"/>
               <w:right w:val="single" w:sz="4" w:space="0" w:color="A9D08E"/>
             </w:tcBorders>
-            <w:shd w:val="clear" w:color="auto" w:fill="auto"/>
             <w:noWrap/>
             <w:vAlign w:val="bottom"/>
             <w:hideMark/>
@@ -8188,7 +8588,6 @@
               <w:bottom w:val="single" w:sz="4" w:space="0" w:color="A9D08E"/>
               <w:right w:val="nil"/>
             </w:tcBorders>
-            <w:shd w:val="clear" w:color="auto" w:fill="auto"/>
             <w:noWrap/>
             <w:vAlign w:val="bottom"/>
             <w:hideMark/>
@@ -8230,7 +8629,6 @@
               <w:bottom w:val="single" w:sz="4" w:space="0" w:color="A9D08E"/>
               <w:right w:val="single" w:sz="4" w:space="0" w:color="A9D08E"/>
             </w:tcBorders>
-            <w:shd w:val="clear" w:color="auto" w:fill="auto"/>
             <w:noWrap/>
             <w:vAlign w:val="bottom"/>
             <w:hideMark/>
@@ -8372,7 +8770,6 @@
               <w:bottom w:val="single" w:sz="4" w:space="0" w:color="A9D08E"/>
               <w:right w:val="nil"/>
             </w:tcBorders>
-            <w:shd w:val="clear" w:color="auto" w:fill="auto"/>
             <w:noWrap/>
             <w:vAlign w:val="bottom"/>
             <w:hideMark/>
@@ -8414,7 +8811,6 @@
               <w:bottom w:val="single" w:sz="4" w:space="0" w:color="A9D08E"/>
               <w:right w:val="single" w:sz="4" w:space="0" w:color="A9D08E"/>
             </w:tcBorders>
-            <w:shd w:val="clear" w:color="auto" w:fill="auto"/>
             <w:noWrap/>
             <w:vAlign w:val="bottom"/>
             <w:hideMark/>
@@ -8556,35 +8952,35 @@
               <w:bottom w:val="single" w:sz="4" w:space="0" w:color="A9D08E"/>
               <w:right w:val="nil"/>
             </w:tcBorders>
-            <w:shd w:val="clear" w:color="auto" w:fill="auto"/>
-            <w:noWrap/>
-            <w:vAlign w:val="bottom"/>
-            <w:hideMark/>
-          </w:tcPr>
-          <w:p>
-            <w:pPr>
-              <w:spacing w:after="0" w:line="240" w:lineRule="auto"/>
-              <w:jc w:val="both"/>
-              <w:rPr>
-                <w:rFonts w:ascii="Times New Roman" w:eastAsia="Times New Roman" w:hAnsi="Times New Roman" w:cs="Times New Roman"/>
-                <w:color w:val="000000"/>
-                <w:kern w:val="0"/>
-                <w:sz w:val="24"/>
-                <w:szCs w:val="24"/>
-                <w:lang w:eastAsia="ru-RU"/>
-                <w14:ligatures w14:val="none"/>
-              </w:rPr>
-            </w:pPr>
-            <w:r>
-              <w:rPr>
-                <w:rFonts w:ascii="Times New Roman" w:eastAsia="Times New Roman" w:hAnsi="Times New Roman" w:cs="Times New Roman"/>
-                <w:color w:val="000000"/>
-                <w:kern w:val="0"/>
-                <w:sz w:val="24"/>
-                <w:szCs w:val="24"/>
-                <w:lang w:eastAsia="ru-RU"/>
-                <w14:ligatures w14:val="none"/>
-              </w:rPr>
+            <w:noWrap/>
+            <w:vAlign w:val="bottom"/>
+            <w:hideMark/>
+          </w:tcPr>
+          <w:p>
+            <w:pPr>
+              <w:spacing w:after="0" w:line="240" w:lineRule="auto"/>
+              <w:jc w:val="both"/>
+              <w:rPr>
+                <w:rFonts w:ascii="Times New Roman" w:eastAsia="Times New Roman" w:hAnsi="Times New Roman" w:cs="Times New Roman"/>
+                <w:color w:val="000000"/>
+                <w:kern w:val="0"/>
+                <w:sz w:val="24"/>
+                <w:szCs w:val="24"/>
+                <w:lang w:eastAsia="ru-RU"/>
+                <w14:ligatures w14:val="none"/>
+              </w:rPr>
+            </w:pPr>
+            <w:r>
+              <w:rPr>
+                <w:rFonts w:ascii="Times New Roman" w:eastAsia="Times New Roman" w:hAnsi="Times New Roman" w:cs="Times New Roman"/>
+                <w:color w:val="000000"/>
+                <w:kern w:val="0"/>
+                <w:sz w:val="24"/>
+                <w:szCs w:val="24"/>
+                <w:lang w:eastAsia="ru-RU"/>
+                <w14:ligatures w14:val="none"/>
+              </w:rPr>
+              <w:lastRenderedPageBreak/>
               <w:t>4,024922359</w:t>
             </w:r>
           </w:p>
@@ -8598,7 +8994,6 @@
               <w:bottom w:val="single" w:sz="4" w:space="0" w:color="A9D08E"/>
               <w:right w:val="single" w:sz="4" w:space="0" w:color="A9D08E"/>
             </w:tcBorders>
-            <w:shd w:val="clear" w:color="auto" w:fill="auto"/>
             <w:noWrap/>
             <w:vAlign w:val="bottom"/>
             <w:hideMark/>
@@ -8740,7 +9135,6 @@
               <w:bottom w:val="single" w:sz="4" w:space="0" w:color="A9D08E"/>
               <w:right w:val="nil"/>
             </w:tcBorders>
-            <w:shd w:val="clear" w:color="auto" w:fill="auto"/>
             <w:noWrap/>
             <w:vAlign w:val="bottom"/>
             <w:hideMark/>
@@ -8782,7 +9176,6 @@
               <w:bottom w:val="single" w:sz="4" w:space="0" w:color="A9D08E"/>
               <w:right w:val="single" w:sz="4" w:space="0" w:color="A9D08E"/>
             </w:tcBorders>
-            <w:shd w:val="clear" w:color="auto" w:fill="auto"/>
             <w:noWrap/>
             <w:vAlign w:val="bottom"/>
             <w:hideMark/>
@@ -8924,7 +9317,6 @@
               <w:bottom w:val="single" w:sz="4" w:space="0" w:color="A9D08E"/>
               <w:right w:val="nil"/>
             </w:tcBorders>
-            <w:shd w:val="clear" w:color="auto" w:fill="auto"/>
             <w:noWrap/>
             <w:vAlign w:val="bottom"/>
             <w:hideMark/>
@@ -8966,7 +9358,6 @@
               <w:bottom w:val="single" w:sz="4" w:space="0" w:color="A9D08E"/>
               <w:right w:val="single" w:sz="4" w:space="0" w:color="A9D08E"/>
             </w:tcBorders>
-            <w:shd w:val="clear" w:color="auto" w:fill="auto"/>
             <w:noWrap/>
             <w:vAlign w:val="bottom"/>
             <w:hideMark/>
@@ -9013,13 +9404,23 @@
           <w:szCs w:val="24"/>
         </w:rPr>
       </w:pPr>
+    </w:p>
+    <w:p>
+      <w:pPr>
+        <w:ind w:left="360"/>
+        <w:jc w:val="both"/>
+        <w:rPr>
+          <w:rFonts w:ascii="Times New Roman" w:hAnsi="Times New Roman" w:cs="Times New Roman"/>
+          <w:sz w:val="24"/>
+          <w:szCs w:val="24"/>
+        </w:rPr>
+      </w:pPr>
       <w:r>
         <w:rPr>
           <w:rFonts w:ascii="Times New Roman" w:hAnsi="Times New Roman" w:cs="Times New Roman"/>
           <w:sz w:val="24"/>
           <w:szCs w:val="24"/>
         </w:rPr>
-        <w:lastRenderedPageBreak/>
         <w:t xml:space="preserve">По </w:t>
       </w:r>
       <w:r>
@@ -9086,6 +9487,14 @@
           <w:szCs w:val="24"/>
         </w:rPr>
       </w:pPr>
+      <w:r>
+        <w:rPr>
+          <w:rFonts w:ascii="Times New Roman" w:hAnsi="Times New Roman" w:cs="Times New Roman"/>
+          <w:sz w:val="24"/>
+          <w:szCs w:val="24"/>
+        </w:rPr>
+        <w:t>Аналогично определим принадлежность к классам остальных объектов тестирующей выборки.</w:t>
+      </w:r>
     </w:p>
     <w:p>
       <w:pPr>
@@ -9107,7 +9516,7 @@
           <w:sz w:val="24"/>
           <w:szCs w:val="24"/>
         </w:rPr>
-        <w:t xml:space="preserve">Сравним метки классов, заданные изначально, с метками классов, полученными в результате анализа </w:t>
+        <w:t xml:space="preserve">На предыдущем шаге мы получили метки классов в результате анализа </w:t>
       </w:r>
       <w:r>
         <w:rPr>
@@ -9124,7 +9533,79 @@
           <w:sz w:val="24"/>
           <w:szCs w:val="24"/>
         </w:rPr>
-        <w:t xml:space="preserve"> ближайших соседей:</w:t>
+        <w:t xml:space="preserve"> </w:t>
+      </w:r>
+      <w:r>
+        <w:rPr>
+          <w:rFonts w:ascii="Times New Roman" w:hAnsi="Times New Roman" w:cs="Times New Roman"/>
+          <w:sz w:val="24"/>
+          <w:szCs w:val="24"/>
+        </w:rPr>
+        <w:t xml:space="preserve">ближайших соседей. </w:t>
+      </w:r>
+      <w:r>
+        <w:rPr>
+          <w:rFonts w:ascii="Times New Roman" w:hAnsi="Times New Roman" w:cs="Times New Roman"/>
+          <w:sz w:val="24"/>
+          <w:szCs w:val="24"/>
+        </w:rPr>
+        <w:t>Сравним</w:t>
+      </w:r>
+      <w:r>
+        <w:rPr>
+          <w:rFonts w:ascii="Times New Roman" w:hAnsi="Times New Roman" w:cs="Times New Roman"/>
+          <w:sz w:val="24"/>
+          <w:szCs w:val="24"/>
+        </w:rPr>
+        <w:t xml:space="preserve"> эти</w:t>
+      </w:r>
+      <w:r>
+        <w:rPr>
+          <w:rFonts w:ascii="Times New Roman" w:hAnsi="Times New Roman" w:cs="Times New Roman"/>
+          <w:sz w:val="24"/>
+          <w:szCs w:val="24"/>
+        </w:rPr>
+        <w:t xml:space="preserve"> метки классов</w:t>
+      </w:r>
+      <w:r>
+        <w:rPr>
+          <w:rFonts w:ascii="Times New Roman" w:hAnsi="Times New Roman" w:cs="Times New Roman"/>
+          <w:sz w:val="24"/>
+          <w:szCs w:val="24"/>
+        </w:rPr>
+        <w:t xml:space="preserve"> с метками классов</w:t>
+      </w:r>
+      <w:r>
+        <w:rPr>
+          <w:rFonts w:ascii="Times New Roman" w:hAnsi="Times New Roman" w:cs="Times New Roman"/>
+          <w:sz w:val="24"/>
+          <w:szCs w:val="24"/>
+        </w:rPr>
+        <w:t>, заданны</w:t>
+      </w:r>
+      <w:r>
+        <w:rPr>
+          <w:rFonts w:ascii="Times New Roman" w:hAnsi="Times New Roman" w:cs="Times New Roman"/>
+          <w:sz w:val="24"/>
+          <w:szCs w:val="24"/>
+        </w:rPr>
+        <w:t>ми</w:t>
+      </w:r>
+      <w:r>
+        <w:rPr>
+          <w:rFonts w:ascii="Times New Roman" w:hAnsi="Times New Roman" w:cs="Times New Roman"/>
+          <w:sz w:val="24"/>
+          <w:szCs w:val="24"/>
+        </w:rPr>
+        <w:t xml:space="preserve"> изначально</w:t>
+      </w:r>
+      <w:r>
+        <w:rPr>
+          <w:rFonts w:ascii="Times New Roman" w:hAnsi="Times New Roman" w:cs="Times New Roman"/>
+          <w:sz w:val="24"/>
+          <w:szCs w:val="24"/>
+        </w:rPr>
+        <w:t>:</w:t>
       </w:r>
     </w:p>
     <w:tbl>
@@ -10539,7 +11020,6 @@
               <w:bottom w:val="single" w:sz="4" w:space="0" w:color="A9D08E"/>
               <w:right w:val="nil"/>
             </w:tcBorders>
-            <w:shd w:val="clear" w:color="auto" w:fill="auto"/>
             <w:noWrap/>
             <w:vAlign w:val="bottom"/>
             <w:hideMark/>
@@ -10581,7 +11061,6 @@
               <w:bottom w:val="single" w:sz="4" w:space="0" w:color="A9D08E"/>
               <w:right w:val="nil"/>
             </w:tcBorders>
-            <w:shd w:val="clear" w:color="auto" w:fill="auto"/>
             <w:noWrap/>
             <w:vAlign w:val="bottom"/>
             <w:hideMark/>
@@ -10623,7 +11102,6 @@
               <w:bottom w:val="single" w:sz="4" w:space="0" w:color="A9D08E"/>
               <w:right w:val="nil"/>
             </w:tcBorders>
-            <w:shd w:val="clear" w:color="auto" w:fill="auto"/>
             <w:noWrap/>
             <w:vAlign w:val="bottom"/>
             <w:hideMark/>
@@ -10665,7 +11143,6 @@
               <w:bottom w:val="single" w:sz="4" w:space="0" w:color="A9D08E"/>
               <w:right w:val="nil"/>
             </w:tcBorders>
-            <w:shd w:val="clear" w:color="auto" w:fill="auto"/>
             <w:noWrap/>
             <w:vAlign w:val="bottom"/>
             <w:hideMark/>
@@ -10707,7 +11184,6 @@
               <w:bottom w:val="single" w:sz="4" w:space="0" w:color="A9D08E"/>
               <w:right w:val="single" w:sz="4" w:space="0" w:color="A9D08E"/>
             </w:tcBorders>
-            <w:shd w:val="clear" w:color="auto" w:fill="auto"/>
             <w:noWrap/>
             <w:vAlign w:val="bottom"/>
             <w:hideMark/>
@@ -11158,23 +11634,7 @@
               <w:sz w:val="24"/>
               <w:szCs w:val="24"/>
             </w:rPr>
-            <m:t>= 0,888889</m:t>
-          </m:r>
-          <m:r>
-            <w:rPr>
-              <w:rFonts w:ascii="Cambria Math" w:hAnsi="Cambria Math" w:cs="Times New Roman"/>
-              <w:sz w:val="24"/>
-              <w:szCs w:val="24"/>
-            </w:rPr>
-            <m:t xml:space="preserve">&gt; </m:t>
-          </m:r>
-          <m:r>
-            <w:rPr>
-              <w:rFonts w:ascii="Cambria Math" w:hAnsi="Cambria Math" w:cs="Times New Roman"/>
-              <w:sz w:val="24"/>
-              <w:szCs w:val="24"/>
-            </w:rPr>
-            <m:t>ε</m:t>
+            <m:t>= 0,888889&gt; ε</m:t>
           </m:r>
         </m:oMath>
       </m:oMathPara>
@@ -11200,13 +11660,39 @@
           <w:szCs w:val="24"/>
         </w:rPr>
       </w:pPr>
+      <w:proofErr w:type="gramStart"/>
       <w:r>
         <w:rPr>
           <w:rFonts w:ascii="Times New Roman" w:eastAsiaTheme="minorEastAsia" w:hAnsi="Times New Roman" w:cs="Times New Roman"/>
           <w:sz w:val="24"/>
           <w:szCs w:val="24"/>
         </w:rPr>
-        <w:t xml:space="preserve">Т.к. итоговая точность превысила порог необходимой точности, то </w:t>
+        <w:t>Т.к.</w:t>
+      </w:r>
+      <w:proofErr w:type="gramEnd"/>
+      <w:r>
+        <w:rPr>
+          <w:rFonts w:ascii="Times New Roman" w:eastAsiaTheme="minorEastAsia" w:hAnsi="Times New Roman" w:cs="Times New Roman"/>
+          <w:sz w:val="24"/>
+          <w:szCs w:val="24"/>
+        </w:rPr>
+        <w:t xml:space="preserve"> итоговая точность превысила порог необходимой точности</w:t>
+      </w:r>
+      <w:r>
+        <w:rPr>
+          <w:rFonts w:ascii="Times New Roman" w:eastAsiaTheme="minorEastAsia" w:hAnsi="Times New Roman" w:cs="Times New Roman"/>
+          <w:sz w:val="24"/>
+          <w:szCs w:val="24"/>
+        </w:rPr>
+        <w:t xml:space="preserve"> классификации</w:t>
+      </w:r>
+      <w:r>
+        <w:rPr>
+          <w:rFonts w:ascii="Times New Roman" w:eastAsiaTheme="minorEastAsia" w:hAnsi="Times New Roman" w:cs="Times New Roman"/>
+          <w:sz w:val="24"/>
+          <w:szCs w:val="24"/>
+        </w:rPr>
+        <w:t xml:space="preserve">, то </w:t>
       </w:r>
       <w:r>
         <w:rPr>
@@ -11236,10 +11722,182 @@
     </w:p>
     <w:p>
       <w:pPr>
+        <w:ind w:left="360"/>
         <w:jc w:val="both"/>
         <w:rPr>
-          <w:rFonts w:ascii="Times New Roman" w:hAnsi="Times New Roman" w:cs="Times New Roman"/>
-          <w:i/>
+          <w:rFonts w:ascii="Times New Roman" w:eastAsiaTheme="minorEastAsia" w:hAnsi="Times New Roman" w:cs="Times New Roman"/>
+          <w:sz w:val="24"/>
+          <w:szCs w:val="24"/>
+        </w:rPr>
+      </w:pPr>
+    </w:p>
+    <w:p>
+      <w:pPr>
+        <w:pStyle w:val="a3"/>
+        <w:numPr>
+          <w:ilvl w:val="0"/>
+          <w:numId w:val="3"/>
+        </w:numPr>
+        <w:jc w:val="both"/>
+        <w:rPr>
+          <w:rFonts w:ascii="Times New Roman" w:eastAsiaTheme="minorEastAsia" w:hAnsi="Times New Roman" w:cs="Times New Roman"/>
+          <w:sz w:val="24"/>
+          <w:szCs w:val="24"/>
+        </w:rPr>
+      </w:pPr>
+      <w:r>
+        <w:rPr>
+          <w:rFonts w:ascii="Times New Roman" w:eastAsiaTheme="minorEastAsia" w:hAnsi="Times New Roman" w:cs="Times New Roman"/>
+          <w:sz w:val="24"/>
+          <w:szCs w:val="24"/>
+        </w:rPr>
+        <w:t>Вывод:</w:t>
+      </w:r>
+    </w:p>
+    <w:p>
+      <w:pPr>
+        <w:ind w:left="360"/>
+        <w:jc w:val="both"/>
+        <w:rPr>
+          <w:rFonts w:ascii="Times New Roman" w:eastAsiaTheme="minorEastAsia" w:hAnsi="Times New Roman" w:cs="Times New Roman"/>
+          <w:sz w:val="24"/>
+          <w:szCs w:val="24"/>
+        </w:rPr>
+      </w:pPr>
+      <w:r>
+        <w:rPr>
+          <w:rFonts w:ascii="Times New Roman" w:eastAsiaTheme="minorEastAsia" w:hAnsi="Times New Roman" w:cs="Times New Roman"/>
+          <w:sz w:val="24"/>
+          <w:szCs w:val="24"/>
+        </w:rPr>
+        <w:t xml:space="preserve">В ходе работы была проведена классификация объектов (цветов ириса) при помощи алгоритма </w:t>
+      </w:r>
+      <w:r>
+        <w:rPr>
+          <w:rFonts w:ascii="Times New Roman" w:eastAsiaTheme="minorEastAsia" w:hAnsi="Times New Roman" w:cs="Times New Roman"/>
+          <w:sz w:val="24"/>
+          <w:szCs w:val="24"/>
+          <w:lang w:val="en-US"/>
+        </w:rPr>
+        <w:t>k</w:t>
+      </w:r>
+      <w:r>
+        <w:rPr>
+          <w:rFonts w:ascii="Times New Roman" w:eastAsiaTheme="minorEastAsia" w:hAnsi="Times New Roman" w:cs="Times New Roman"/>
+          <w:sz w:val="24"/>
+          <w:szCs w:val="24"/>
+        </w:rPr>
+        <w:t>-</w:t>
+      </w:r>
+      <w:r>
+        <w:rPr>
+          <w:rFonts w:ascii="Times New Roman" w:eastAsiaTheme="minorEastAsia" w:hAnsi="Times New Roman" w:cs="Times New Roman"/>
+          <w:sz w:val="24"/>
+          <w:szCs w:val="24"/>
+          <w:lang w:val="en-US"/>
+        </w:rPr>
+        <w:t>NN</w:t>
+      </w:r>
+      <w:r>
+        <w:rPr>
+          <w:rFonts w:ascii="Times New Roman" w:eastAsiaTheme="minorEastAsia" w:hAnsi="Times New Roman" w:cs="Times New Roman"/>
+          <w:sz w:val="24"/>
+          <w:szCs w:val="24"/>
+        </w:rPr>
+        <w:t xml:space="preserve"> с заданной точностью</w:t>
+      </w:r>
+      <w:r>
+        <w:rPr>
+          <w:rFonts w:ascii="Times New Roman" w:eastAsiaTheme="minorEastAsia" w:hAnsi="Times New Roman" w:cs="Times New Roman"/>
+          <w:sz w:val="24"/>
+          <w:szCs w:val="24"/>
+        </w:rPr>
+        <w:t>:</w:t>
+      </w:r>
+    </w:p>
+    <w:p>
+      <w:pPr>
+        <w:ind w:left="360"/>
+        <w:jc w:val="both"/>
+        <w:rPr>
+          <w:rFonts w:ascii="Times New Roman" w:eastAsiaTheme="minorEastAsia" w:hAnsi="Times New Roman" w:cs="Times New Roman"/>
+          <w:sz w:val="24"/>
+          <w:szCs w:val="24"/>
+        </w:rPr>
+      </w:pPr>
+      <m:oMathPara>
+        <m:oMath>
+          <m:r>
+            <w:rPr>
+              <w:rFonts w:ascii="Cambria Math" w:hAnsi="Cambria Math" w:cs="Times New Roman"/>
+              <w:sz w:val="24"/>
+              <w:szCs w:val="24"/>
+              <w:lang w:val="en-US"/>
+            </w:rPr>
+            <w:lastRenderedPageBreak/>
+            <m:t>Prec</m:t>
+          </m:r>
+          <m:r>
+            <w:rPr>
+              <w:rFonts w:ascii="Cambria Math" w:hAnsi="Cambria Math" w:cs="Times New Roman"/>
+              <w:sz w:val="24"/>
+              <w:szCs w:val="24"/>
+            </w:rPr>
+            <m:t>=0,85</m:t>
+          </m:r>
+        </m:oMath>
+      </m:oMathPara>
+    </w:p>
+    <w:p>
+      <w:pPr>
+        <w:ind w:left="360"/>
+        <w:jc w:val="both"/>
+        <w:rPr>
+          <w:rFonts w:ascii="Times New Roman" w:eastAsiaTheme="minorEastAsia" w:hAnsi="Times New Roman" w:cs="Times New Roman"/>
+          <w:sz w:val="24"/>
+          <w:szCs w:val="24"/>
+        </w:rPr>
+      </w:pPr>
+      <w:r>
+        <w:rPr>
+          <w:rFonts w:ascii="Times New Roman" w:eastAsiaTheme="minorEastAsia" w:hAnsi="Times New Roman" w:cs="Times New Roman"/>
+          <w:sz w:val="24"/>
+          <w:szCs w:val="24"/>
+        </w:rPr>
+        <w:t xml:space="preserve">Необходимая точность была получена при анализе </w:t>
+      </w:r>
+      <w:r>
+        <w:rPr>
+          <w:rFonts w:ascii="Times New Roman" w:eastAsiaTheme="minorEastAsia" w:hAnsi="Times New Roman" w:cs="Times New Roman"/>
+          <w:sz w:val="24"/>
+          <w:szCs w:val="24"/>
+          <w:lang w:val="en-US"/>
+        </w:rPr>
+        <w:t>k</w:t>
+      </w:r>
+      <w:r>
+        <w:rPr>
+          <w:rFonts w:ascii="Times New Roman" w:eastAsiaTheme="minorEastAsia" w:hAnsi="Times New Roman" w:cs="Times New Roman"/>
+          <w:sz w:val="24"/>
+          <w:szCs w:val="24"/>
+        </w:rPr>
+        <w:t xml:space="preserve"> = 3 </w:t>
+      </w:r>
+      <w:r>
+        <w:rPr>
+          <w:rFonts w:ascii="Times New Roman" w:eastAsiaTheme="minorEastAsia" w:hAnsi="Times New Roman" w:cs="Times New Roman"/>
+          <w:sz w:val="24"/>
+          <w:szCs w:val="24"/>
+        </w:rPr>
+        <w:t>ближайших соседей.</w:t>
+      </w:r>
+    </w:p>
+    <w:p>
+      <w:pPr>
+        <w:ind w:left="360"/>
+        <w:jc w:val="both"/>
+        <w:rPr>
+          <w:rFonts w:ascii="Times New Roman" w:eastAsiaTheme="minorEastAsia" w:hAnsi="Times New Roman" w:cs="Times New Roman"/>
           <w:sz w:val="24"/>
           <w:szCs w:val="24"/>
         </w:rPr>
@@ -11257,7 +11915,7 @@
 </file>
 
 <file path=word/endnotes.xml><?xml version="1.0" encoding="utf-8"?>
-<w:endnotes xmlns:wpc="http://schemas.microsoft.com/office/word/2010/wordprocessingCanvas" xmlns:cx="http://schemas.microsoft.com/office/drawing/2014/chartex" xmlns:cx1="http://schemas.microsoft.com/office/drawing/2015/9/8/chartex" xmlns:cx2="http://schemas.microsoft.com/office/drawing/2015/10/21/chartex" xmlns:cx3="http://schemas.microsoft.com/office/drawing/2016/5/9/chartex" xmlns:cx4="http://schemas.microsoft.com/office/drawing/2016/5/10/chartex" xmlns:cx5="http://schemas.microsoft.com/office/drawing/2016/5/11/chartex" xmlns:cx6="http://schemas.microsoft.com/office/drawing/2016/5/12/chartex" xmlns:cx7="http://schemas.microsoft.com/office/drawing/2016/5/13/chartex" xmlns:cx8="http://schemas.microsoft.com/office/drawing/2016/5/14/chartex" xmlns:mc="http://schemas.openxmlformats.org/markup-compatibility/2006" xmlns:aink="http://schemas.microsoft.com/office/drawing/2016/ink" xmlns:am3d="http://schemas.microsoft.com/office/drawing/2017/model3d" xmlns:o="urn:schemas-microsoft-com:office:office" xmlns:r="http://schemas.openxmlformats.org/officeDocument/2006/relationships" xmlns:m="http://schemas.openxmlformats.org/officeDocument/2006/math" xmlns:v="urn:schemas-microsoft-com:vml" xmlns:wp14="http://schemas.microsoft.com/office/word/2010/wordprocessingDrawing" xmlns:wp="http://schemas.openxmlformats.org/drawingml/2006/wordprocessingDrawing" xmlns:w10="urn:schemas-microsoft-com:office:word" xmlns:w="http://schemas.openxmlformats.org/wordprocessingml/2006/main" xmlns:w14="http://schemas.microsoft.com/office/word/2010/wordml" xmlns:w15="http://schemas.microsoft.com/office/word/2012/wordml" xmlns:w16cex="http://schemas.microsoft.com/office/word/2018/wordml/cex" xmlns:w16cid="http://schemas.microsoft.com/office/word/2016/wordml/cid" xmlns:w16="http://schemas.microsoft.com/office/word/2018/wordml" xmlns:w16sdtdh="http://schemas.microsoft.com/office/word/2020/wordml/sdtdatahash" xmlns:w16se="http://schemas.microsoft.com/office/word/2015/wordml/symex" xmlns:wpg="http://schemas.microsoft.com/office/word/2010/wordprocessingGroup" xmlns:wpi="http://schemas.microsoft.com/office/word/2010/wordprocessingInk" xmlns:wne="http://schemas.microsoft.com/office/word/2006/wordml" xmlns:wps="http://schemas.microsoft.com/office/word/2010/wordprocessingShape" mc:Ignorable="w14 w15 w16se w16cid w16 w16cex w16sdtdh wp14">
+<w:endnotes xmlns:wpc="http://schemas.microsoft.com/office/word/2010/wordprocessingCanvas" xmlns:cx="http://schemas.microsoft.com/office/drawing/2014/chartex" xmlns:cx1="http://schemas.microsoft.com/office/drawing/2015/9/8/chartex" xmlns:cx2="http://schemas.microsoft.com/office/drawing/2015/10/21/chartex" xmlns:cx3="http://schemas.microsoft.com/office/drawing/2016/5/9/chartex" xmlns:cx4="http://schemas.microsoft.com/office/drawing/2016/5/10/chartex" xmlns:cx5="http://schemas.microsoft.com/office/drawing/2016/5/11/chartex" xmlns:cx6="http://schemas.microsoft.com/office/drawing/2016/5/12/chartex" xmlns:cx7="http://schemas.microsoft.com/office/drawing/2016/5/13/chartex" xmlns:cx8="http://schemas.microsoft.com/office/drawing/2016/5/14/chartex" xmlns:mc="http://schemas.openxmlformats.org/markup-compatibility/2006" xmlns:aink="http://schemas.microsoft.com/office/drawing/2016/ink" xmlns:am3d="http://schemas.microsoft.com/office/drawing/2017/model3d" xmlns:o="urn:schemas-microsoft-com:office:office" xmlns:oel="http://schemas.microsoft.com/office/2019/extlst" xmlns:r="http://schemas.openxmlformats.org/officeDocument/2006/relationships" xmlns:m="http://schemas.openxmlformats.org/officeDocument/2006/math" xmlns:v="urn:schemas-microsoft-com:vml" xmlns:wp14="http://schemas.microsoft.com/office/word/2010/wordprocessingDrawing" xmlns:wp="http://schemas.openxmlformats.org/drawingml/2006/wordprocessingDrawing" xmlns:w10="urn:schemas-microsoft-com:office:word" xmlns:w="http://schemas.openxmlformats.org/wordprocessingml/2006/main" xmlns:w14="http://schemas.microsoft.com/office/word/2010/wordml" xmlns:w15="http://schemas.microsoft.com/office/word/2012/wordml" xmlns:w16cex="http://schemas.microsoft.com/office/word/2018/wordml/cex" xmlns:w16cid="http://schemas.microsoft.com/office/word/2016/wordml/cid" xmlns:w16="http://schemas.microsoft.com/office/word/2018/wordml" xmlns:w16du="http://schemas.microsoft.com/office/word/2023/wordml/word16du" xmlns:w16sdtdh="http://schemas.microsoft.com/office/word/2020/wordml/sdtdatahash" xmlns:w16sdtfl="http://schemas.microsoft.com/office/word/2024/wordml/sdtformatlock" xmlns:w16se="http://schemas.microsoft.com/office/word/2015/wordml/symex" xmlns:wpg="http://schemas.microsoft.com/office/word/2010/wordprocessingGroup" xmlns:wpi="http://schemas.microsoft.com/office/word/2010/wordprocessingInk" xmlns:wne="http://schemas.microsoft.com/office/word/2006/wordml" xmlns:wps="http://schemas.microsoft.com/office/word/2010/wordprocessingShape" mc:Ignorable="w14 w15 w16se w16cid w16 w16cex w16sdtdh w16sdtfl w16du wp14">
   <w:endnote w:type="separator" w:id="-1">
     <w:p>
       <w:pPr>
@@ -11282,7 +11940,7 @@
 </file>
 
 <file path=word/footer1.xml><?xml version="1.0" encoding="utf-8"?>
-<w:ftr xmlns:wpc="http://schemas.microsoft.com/office/word/2010/wordprocessingCanvas" xmlns:cx="http://schemas.microsoft.com/office/drawing/2014/chartex" xmlns:cx1="http://schemas.microsoft.com/office/drawing/2015/9/8/chartex" xmlns:cx2="http://schemas.microsoft.com/office/drawing/2015/10/21/chartex" xmlns:cx3="http://schemas.microsoft.com/office/drawing/2016/5/9/chartex" xmlns:cx4="http://schemas.microsoft.com/office/drawing/2016/5/10/chartex" xmlns:cx5="http://schemas.microsoft.com/office/drawing/2016/5/11/chartex" xmlns:cx6="http://schemas.microsoft.com/office/drawing/2016/5/12/chartex" xmlns:cx7="http://schemas.microsoft.com/office/drawing/2016/5/13/chartex" xmlns:cx8="http://schemas.microsoft.com/office/drawing/2016/5/14/chartex" xmlns:mc="http://schemas.openxmlformats.org/markup-compatibility/2006" xmlns:aink="http://schemas.microsoft.com/office/drawing/2016/ink" xmlns:am3d="http://schemas.microsoft.com/office/drawing/2017/model3d" xmlns:o="urn:schemas-microsoft-com:office:office" xmlns:r="http://schemas.openxmlformats.org/officeDocument/2006/relationships" xmlns:m="http://schemas.openxmlformats.org/officeDocument/2006/math" xmlns:v="urn:schemas-microsoft-com:vml" xmlns:wp14="http://schemas.microsoft.com/office/word/2010/wordprocessingDrawing" xmlns:wp="http://schemas.openxmlformats.org/drawingml/2006/wordprocessingDrawing" xmlns:w10="urn:schemas-microsoft-com:office:word" xmlns:w="http://schemas.openxmlformats.org/wordprocessingml/2006/main" xmlns:w14="http://schemas.microsoft.com/office/word/2010/wordml" xmlns:w15="http://schemas.microsoft.com/office/word/2012/wordml" xmlns:w16cex="http://schemas.microsoft.com/office/word/2018/wordml/cex" xmlns:w16cid="http://schemas.microsoft.com/office/word/2016/wordml/cid" xmlns:w16="http://schemas.microsoft.com/office/word/2018/wordml" xmlns:w16sdtdh="http://schemas.microsoft.com/office/word/2020/wordml/sdtdatahash" xmlns:w16se="http://schemas.microsoft.com/office/word/2015/wordml/symex" xmlns:wpg="http://schemas.microsoft.com/office/word/2010/wordprocessingGroup" xmlns:wpi="http://schemas.microsoft.com/office/word/2010/wordprocessingInk" xmlns:wne="http://schemas.microsoft.com/office/word/2006/wordml" xmlns:wps="http://schemas.microsoft.com/office/word/2010/wordprocessingShape" mc:Ignorable="w14 w15 w16se w16cid w16 w16cex w16sdtdh wp14">
+<w:ftr xmlns:wpc="http://schemas.microsoft.com/office/word/2010/wordprocessingCanvas" xmlns:cx="http://schemas.microsoft.com/office/drawing/2014/chartex" xmlns:cx1="http://schemas.microsoft.com/office/drawing/2015/9/8/chartex" xmlns:cx2="http://schemas.microsoft.com/office/drawing/2015/10/21/chartex" xmlns:cx3="http://schemas.microsoft.com/office/drawing/2016/5/9/chartex" xmlns:cx4="http://schemas.microsoft.com/office/drawing/2016/5/10/chartex" xmlns:cx5="http://schemas.microsoft.com/office/drawing/2016/5/11/chartex" xmlns:cx6="http://schemas.microsoft.com/office/drawing/2016/5/12/chartex" xmlns:cx7="http://schemas.microsoft.com/office/drawing/2016/5/13/chartex" xmlns:cx8="http://schemas.microsoft.com/office/drawing/2016/5/14/chartex" xmlns:mc="http://schemas.openxmlformats.org/markup-compatibility/2006" xmlns:aink="http://schemas.microsoft.com/office/drawing/2016/ink" xmlns:am3d="http://schemas.microsoft.com/office/drawing/2017/model3d" xmlns:o="urn:schemas-microsoft-com:office:office" xmlns:oel="http://schemas.microsoft.com/office/2019/extlst" xmlns:r="http://schemas.openxmlformats.org/officeDocument/2006/relationships" xmlns:m="http://schemas.openxmlformats.org/officeDocument/2006/math" xmlns:v="urn:schemas-microsoft-com:vml" xmlns:wp14="http://schemas.microsoft.com/office/word/2010/wordprocessingDrawing" xmlns:wp="http://schemas.openxmlformats.org/drawingml/2006/wordprocessingDrawing" xmlns:w10="urn:schemas-microsoft-com:office:word" xmlns:w="http://schemas.openxmlformats.org/wordprocessingml/2006/main" xmlns:w14="http://schemas.microsoft.com/office/word/2010/wordml" xmlns:w15="http://schemas.microsoft.com/office/word/2012/wordml" xmlns:w16cex="http://schemas.microsoft.com/office/word/2018/wordml/cex" xmlns:w16cid="http://schemas.microsoft.com/office/word/2016/wordml/cid" xmlns:w16="http://schemas.microsoft.com/office/word/2018/wordml" xmlns:w16du="http://schemas.microsoft.com/office/word/2023/wordml/word16du" xmlns:w16sdtdh="http://schemas.microsoft.com/office/word/2020/wordml/sdtdatahash" xmlns:w16sdtfl="http://schemas.microsoft.com/office/word/2024/wordml/sdtformatlock" xmlns:w16se="http://schemas.microsoft.com/office/word/2015/wordml/symex" xmlns:wpg="http://schemas.microsoft.com/office/word/2010/wordprocessingGroup" xmlns:wpi="http://schemas.microsoft.com/office/word/2010/wordprocessingInk" xmlns:wne="http://schemas.microsoft.com/office/word/2006/wordml" xmlns:wps="http://schemas.microsoft.com/office/word/2010/wordprocessingShape" mc:Ignorable="w14 w15 w16se w16cid w16 w16cex w16sdtdh w16sdtfl w16du wp14">
   <w:sdt>
     <w:sdtPr>
       <w:id w:val="1430930278"/>
@@ -11324,7 +11982,7 @@
 </file>
 
 <file path=word/footnotes.xml><?xml version="1.0" encoding="utf-8"?>
-<w:footnotes xmlns:wpc="http://schemas.microsoft.com/office/word/2010/wordprocessingCanvas" xmlns:cx="http://schemas.microsoft.com/office/drawing/2014/chartex" xmlns:cx1="http://schemas.microsoft.com/office/drawing/2015/9/8/chartex" xmlns:cx2="http://schemas.microsoft.com/office/drawing/2015/10/21/chartex" xmlns:cx3="http://schemas.microsoft.com/office/drawing/2016/5/9/chartex" xmlns:cx4="http://schemas.microsoft.com/office/drawing/2016/5/10/chartex" xmlns:cx5="http://schemas.microsoft.com/office/drawing/2016/5/11/chartex" xmlns:cx6="http://schemas.microsoft.com/office/drawing/2016/5/12/chartex" xmlns:cx7="http://schemas.microsoft.com/office/drawing/2016/5/13/chartex" xmlns:cx8="http://schemas.microsoft.com/office/drawing/2016/5/14/chartex" xmlns:mc="http://schemas.openxmlformats.org/markup-compatibility/2006" xmlns:aink="http://schemas.microsoft.com/office/drawing/2016/ink" xmlns:am3d="http://schemas.microsoft.com/office/drawing/2017/model3d" xmlns:o="urn:schemas-microsoft-com:office:office" xmlns:r="http://schemas.openxmlformats.org/officeDocument/2006/relationships" xmlns:m="http://schemas.openxmlformats.org/officeDocument/2006/math" xmlns:v="urn:schemas-microsoft-com:vml" xmlns:wp14="http://schemas.microsoft.com/office/word/2010/wordprocessingDrawing" xmlns:wp="http://schemas.openxmlformats.org/drawingml/2006/wordprocessingDrawing" xmlns:w10="urn:schemas-microsoft-com:office:word" xmlns:w="http://schemas.openxmlformats.org/wordprocessingml/2006/main" xmlns:w14="http://schemas.microsoft.com/office/word/2010/wordml" xmlns:w15="http://schemas.microsoft.com/office/word/2012/wordml" xmlns:w16cex="http://schemas.microsoft.com/office/word/2018/wordml/cex" xmlns:w16cid="http://schemas.microsoft.com/office/word/2016/wordml/cid" xmlns:w16="http://schemas.microsoft.com/office/word/2018/wordml" xmlns:w16sdtdh="http://schemas.microsoft.com/office/word/2020/wordml/sdtdatahash" xmlns:w16se="http://schemas.microsoft.com/office/word/2015/wordml/symex" xmlns:wpg="http://schemas.microsoft.com/office/word/2010/wordprocessingGroup" xmlns:wpi="http://schemas.microsoft.com/office/word/2010/wordprocessingInk" xmlns:wne="http://schemas.microsoft.com/office/word/2006/wordml" xmlns:wps="http://schemas.microsoft.com/office/word/2010/wordprocessingShape" mc:Ignorable="w14 w15 w16se w16cid w16 w16cex w16sdtdh wp14">
+<w:footnotes xmlns:wpc="http://schemas.microsoft.com/office/word/2010/wordprocessingCanvas" xmlns:cx="http://schemas.microsoft.com/office/drawing/2014/chartex" xmlns:cx1="http://schemas.microsoft.com/office/drawing/2015/9/8/chartex" xmlns:cx2="http://schemas.microsoft.com/office/drawing/2015/10/21/chartex" xmlns:cx3="http://schemas.microsoft.com/office/drawing/2016/5/9/chartex" xmlns:cx4="http://schemas.microsoft.com/office/drawing/2016/5/10/chartex" xmlns:cx5="http://schemas.microsoft.com/office/drawing/2016/5/11/chartex" xmlns:cx6="http://schemas.microsoft.com/office/drawing/2016/5/12/chartex" xmlns:cx7="http://schemas.microsoft.com/office/drawing/2016/5/13/chartex" xmlns:cx8="http://schemas.microsoft.com/office/drawing/2016/5/14/chartex" xmlns:mc="http://schemas.openxmlformats.org/markup-compatibility/2006" xmlns:aink="http://schemas.microsoft.com/office/drawing/2016/ink" xmlns:am3d="http://schemas.microsoft.com/office/drawing/2017/model3d" xmlns:o="urn:schemas-microsoft-com:office:office" xmlns:oel="http://schemas.microsoft.com/office/2019/extlst" xmlns:r="http://schemas.openxmlformats.org/officeDocument/2006/relationships" xmlns:m="http://schemas.openxmlformats.org/officeDocument/2006/math" xmlns:v="urn:schemas-microsoft-com:vml" xmlns:wp14="http://schemas.microsoft.com/office/word/2010/wordprocessingDrawing" xmlns:wp="http://schemas.openxmlformats.org/drawingml/2006/wordprocessingDrawing" xmlns:w10="urn:schemas-microsoft-com:office:word" xmlns:w="http://schemas.openxmlformats.org/wordprocessingml/2006/main" xmlns:w14="http://schemas.microsoft.com/office/word/2010/wordml" xmlns:w15="http://schemas.microsoft.com/office/word/2012/wordml" xmlns:w16cex="http://schemas.microsoft.com/office/word/2018/wordml/cex" xmlns:w16cid="http://schemas.microsoft.com/office/word/2016/wordml/cid" xmlns:w16="http://schemas.microsoft.com/office/word/2018/wordml" xmlns:w16du="http://schemas.microsoft.com/office/word/2023/wordml/word16du" xmlns:w16sdtdh="http://schemas.microsoft.com/office/word/2020/wordml/sdtdatahash" xmlns:w16sdtfl="http://schemas.microsoft.com/office/word/2024/wordml/sdtformatlock" xmlns:w16se="http://schemas.microsoft.com/office/word/2015/wordml/symex" xmlns:wpg="http://schemas.microsoft.com/office/word/2010/wordprocessingGroup" xmlns:wpi="http://schemas.microsoft.com/office/word/2010/wordprocessingInk" xmlns:wne="http://schemas.microsoft.com/office/word/2006/wordml" xmlns:wps="http://schemas.microsoft.com/office/word/2010/wordprocessingShape" mc:Ignorable="w14 w15 w16se w16cid w16 w16cex w16sdtdh w16sdtfl w16du wp14">
   <w:footnote w:type="separator" w:id="-1">
     <w:p>
       <w:pPr>
@@ -11349,7 +12007,7 @@
 </file>
 
 <file path=word/numbering.xml><?xml version="1.0" encoding="utf-8"?>
-<w:numbering xmlns:wpc="http://schemas.microsoft.com/office/word/2010/wordprocessingCanvas" xmlns:cx="http://schemas.microsoft.com/office/drawing/2014/chartex" xmlns:cx1="http://schemas.microsoft.com/office/drawing/2015/9/8/chartex" xmlns:cx2="http://schemas.microsoft.com/office/drawing/2015/10/21/chartex" xmlns:cx3="http://schemas.microsoft.com/office/drawing/2016/5/9/chartex" xmlns:cx4="http://schemas.microsoft.com/office/drawing/2016/5/10/chartex" xmlns:cx5="http://schemas.microsoft.com/office/drawing/2016/5/11/chartex" xmlns:cx6="http://schemas.microsoft.com/office/drawing/2016/5/12/chartex" xmlns:cx7="http://schemas.microsoft.com/office/drawing/2016/5/13/chartex" xmlns:cx8="http://schemas.microsoft.com/office/drawing/2016/5/14/chartex" xmlns:mc="http://schemas.openxmlformats.org/markup-compatibility/2006" xmlns:aink="http://schemas.microsoft.com/office/drawing/2016/ink" xmlns:am3d="http://schemas.microsoft.com/office/drawing/2017/model3d" xmlns:o="urn:schemas-microsoft-com:office:office" xmlns:r="http://schemas.openxmlformats.org/officeDocument/2006/relationships" xmlns:m="http://schemas.openxmlformats.org/officeDocument/2006/math" xmlns:v="urn:schemas-microsoft-com:vml" xmlns:wp14="http://schemas.microsoft.com/office/word/2010/wordprocessingDrawing" xmlns:wp="http://schemas.openxmlformats.org/drawingml/2006/wordprocessingDrawing" xmlns:w10="urn:schemas-microsoft-com:office:word" xmlns:w="http://schemas.openxmlformats.org/wordprocessingml/2006/main" xmlns:w14="http://schemas.microsoft.com/office/word/2010/wordml" xmlns:w15="http://schemas.microsoft.com/office/word/2012/wordml" xmlns:w16cex="http://schemas.microsoft.com/office/word/2018/wordml/cex" xmlns:w16cid="http://schemas.microsoft.com/office/word/2016/wordml/cid" xmlns:w16="http://schemas.microsoft.com/office/word/2018/wordml" xmlns:w16sdtdh="http://schemas.microsoft.com/office/word/2020/wordml/sdtdatahash" xmlns:w16se="http://schemas.microsoft.com/office/word/2015/wordml/symex" xmlns:wpg="http://schemas.microsoft.com/office/word/2010/wordprocessingGroup" xmlns:wpi="http://schemas.microsoft.com/office/word/2010/wordprocessingInk" xmlns:wne="http://schemas.microsoft.com/office/word/2006/wordml" xmlns:wps="http://schemas.microsoft.com/office/word/2010/wordprocessingShape" mc:Ignorable="w14 w15 w16se w16cid w16 w16cex w16sdtdh wp14">
+<w:numbering xmlns:wpc="http://schemas.microsoft.com/office/word/2010/wordprocessingCanvas" xmlns:cx="http://schemas.microsoft.com/office/drawing/2014/chartex" xmlns:cx1="http://schemas.microsoft.com/office/drawing/2015/9/8/chartex" xmlns:cx2="http://schemas.microsoft.com/office/drawing/2015/10/21/chartex" xmlns:cx3="http://schemas.microsoft.com/office/drawing/2016/5/9/chartex" xmlns:cx4="http://schemas.microsoft.com/office/drawing/2016/5/10/chartex" xmlns:cx5="http://schemas.microsoft.com/office/drawing/2016/5/11/chartex" xmlns:cx6="http://schemas.microsoft.com/office/drawing/2016/5/12/chartex" xmlns:cx7="http://schemas.microsoft.com/office/drawing/2016/5/13/chartex" xmlns:cx8="http://schemas.microsoft.com/office/drawing/2016/5/14/chartex" xmlns:mc="http://schemas.openxmlformats.org/markup-compatibility/2006" xmlns:aink="http://schemas.microsoft.com/office/drawing/2016/ink" xmlns:am3d="http://schemas.microsoft.com/office/drawing/2017/model3d" xmlns:o="urn:schemas-microsoft-com:office:office" xmlns:oel="http://schemas.microsoft.com/office/2019/extlst" xmlns:r="http://schemas.openxmlformats.org/officeDocument/2006/relationships" xmlns:m="http://schemas.openxmlformats.org/officeDocument/2006/math" xmlns:v="urn:schemas-microsoft-com:vml" xmlns:wp14="http://schemas.microsoft.com/office/word/2010/wordprocessingDrawing" xmlns:wp="http://schemas.openxmlformats.org/drawingml/2006/wordprocessingDrawing" xmlns:w10="urn:schemas-microsoft-com:office:word" xmlns:w="http://schemas.openxmlformats.org/wordprocessingml/2006/main" xmlns:w14="http://schemas.microsoft.com/office/word/2010/wordml" xmlns:w15="http://schemas.microsoft.com/office/word/2012/wordml" xmlns:w16cex="http://schemas.microsoft.com/office/word/2018/wordml/cex" xmlns:w16cid="http://schemas.microsoft.com/office/word/2016/wordml/cid" xmlns:w16="http://schemas.microsoft.com/office/word/2018/wordml" xmlns:w16du="http://schemas.microsoft.com/office/word/2023/wordml/word16du" xmlns:w16sdtdh="http://schemas.microsoft.com/office/word/2020/wordml/sdtdatahash" xmlns:w16sdtfl="http://schemas.microsoft.com/office/word/2024/wordml/sdtformatlock" xmlns:w16se="http://schemas.microsoft.com/office/word/2015/wordml/symex" xmlns:wpg="http://schemas.microsoft.com/office/word/2010/wordprocessingGroup" xmlns:wpi="http://schemas.microsoft.com/office/word/2010/wordprocessingInk" xmlns:wne="http://schemas.microsoft.com/office/word/2006/wordml" xmlns:wps="http://schemas.microsoft.com/office/word/2010/wordprocessingShape" mc:Ignorable="w14 w15 w16se w16cid w16 w16cex w16sdtdh w16sdtfl w16du wp14">
   <w:abstractNum w:abstractNumId="0" w15:restartNumberingAfterBreak="0">
     <w:nsid w:val="0E7B45DE"/>
     <w:multiLevelType w:val="hybridMultilevel"/>
@@ -11611,20 +12269,20 @@
       </w:pPr>
     </w:lvl>
   </w:abstractNum>
-  <w:num w:numId="1">
+  <w:num w:numId="1" w16cid:durableId="789282664">
     <w:abstractNumId w:val="2"/>
   </w:num>
-  <w:num w:numId="2">
+  <w:num w:numId="2" w16cid:durableId="530654967">
     <w:abstractNumId w:val="1"/>
   </w:num>
-  <w:num w:numId="3">
+  <w:num w:numId="3" w16cid:durableId="1685477743">
     <w:abstractNumId w:val="0"/>
   </w:num>
 </w:numbering>
 </file>
 
 <file path=word/styles.xml><?xml version="1.0" encoding="utf-8"?>
-<w:styles xmlns:mc="http://schemas.openxmlformats.org/markup-compatibility/2006" xmlns:r="http://schemas.openxmlformats.org/officeDocument/2006/relationships" xmlns:w="http://schemas.openxmlformats.org/wordprocessingml/2006/main" xmlns:w14="http://schemas.microsoft.com/office/word/2010/wordml" xmlns:w15="http://schemas.microsoft.com/office/word/2012/wordml" xmlns:w16cex="http://schemas.microsoft.com/office/word/2018/wordml/cex" xmlns:w16cid="http://schemas.microsoft.com/office/word/2016/wordml/cid" xmlns:w16="http://schemas.microsoft.com/office/word/2018/wordml" xmlns:w16sdtdh="http://schemas.microsoft.com/office/word/2020/wordml/sdtdatahash" xmlns:w16se="http://schemas.microsoft.com/office/word/2015/wordml/symex" mc:Ignorable="w14 w15 w16se w16cid w16 w16cex w16sdtdh">
+<w:styles xmlns:mc="http://schemas.openxmlformats.org/markup-compatibility/2006" xmlns:r="http://schemas.openxmlformats.org/officeDocument/2006/relationships" xmlns:w="http://schemas.openxmlformats.org/wordprocessingml/2006/main" xmlns:w14="http://schemas.microsoft.com/office/word/2010/wordml" xmlns:w15="http://schemas.microsoft.com/office/word/2012/wordml" xmlns:w16cex="http://schemas.microsoft.com/office/word/2018/wordml/cex" xmlns:w16cid="http://schemas.microsoft.com/office/word/2016/wordml/cid" xmlns:w16="http://schemas.microsoft.com/office/word/2018/wordml" xmlns:w16du="http://schemas.microsoft.com/office/word/2023/wordml/word16du" xmlns:w16sdtdh="http://schemas.microsoft.com/office/word/2020/wordml/sdtdatahash" xmlns:w16sdtfl="http://schemas.microsoft.com/office/word/2024/wordml/sdtformatlock" xmlns:w16se="http://schemas.microsoft.com/office/word/2015/wordml/symex" mc:Ignorable="w14 w15 w16se w16cid w16 w16cex w16sdtdh w16sdtfl w16du">
   <w:docDefaults>
     <w:rPrDefault>
       <w:rPr>
@@ -12023,6 +12681,7 @@
   <w:style w:type="paragraph" w:default="1" w:styleId="a">
     <w:name w:val="Normal"/>
     <w:qFormat/>
+    <w:rsid w:val="00D52D97"/>
   </w:style>
   <w:style w:type="character" w:default="1" w:styleId="a0">
     <w:name w:val="Default Paragraph Font"/>

</xml_diff>